<commit_message>
Phase 2/3 progress: character assets, fireball shooting, transitions, third-party pipeline, and SMB3 systems updates
</commit_message>
<xml_diff>
--- a/Assets/The Forge/Week10 Log_.docx
+++ b/Assets/The Forge/Week10 Log_.docx
@@ -162,6 +162,11 @@
     <w:p>
       <w:r>
         <w:t>[2026-04-02 18:50:48] Copilot session: Fixed top HUD visibility by using unified DrawAll in boss scene and drawing storm flash before HUD; enlarged gameplay characters by 50% (Player and Enemy base sizes). Build: successful. Next: extend 50% geometry scaling pass to remaining scenes if needed.</w:t>
+      </w:r>
+    </w:p>
+    <w:p>
+      <w:r>
+        <w:t>[2026-04-04 12:10] Copilot Session: Fixed Crew/Character sprite asset wiring; fixed SceneTransition black-screen stall; fixed ice wall spawn anchoring; continued Phase 3 by wiring star coin spawn/draw/update in IslandScene. Build: PASS. Next: continue Phase 2/3 feature pipeline.</w:t>
       </w:r>
     </w:p>
     <w:sectPr>

</xml_diff>